<commit_message>
Fixed UCI softwareiec target introduction text.
</commit_message>
<xml_diff>
--- a/doc/uci_softiec_target.docx
+++ b/doc/uci_softiec_target.docx
@@ -1546,11 +1546,6 @@
       <w:bookmarkEnd w:id="1"/>
     </w:p>
     <w:p>
-      <w:pPr>
-        <w:rPr>
-          <w:rFonts w:ascii="Times New Roman" w:hAnsi="Times New Roman" w:cs="Times New Roman"/>
-        </w:rPr>
-      </w:pPr>
       <w:r>
         <w:t xml:space="preserve">The </w:t>
       </w:r>
@@ -1568,21 +1563,35 @@
         </w:rPr>
         <w:t xml:space="preserve">UCI </w:t>
       </w:r>
+      <w:proofErr w:type="spellStart"/>
       <w:r>
         <w:rPr>
           <w:b/>
           <w:bCs/>
         </w:rPr>
-        <w:t>Control Target”</w:t>
-      </w:r>
-      <w:r>
-        <w:t xml:space="preserve"> provides a low-level interface to manage the hardware state of the Ultimate cartridge </w:t>
-      </w:r>
-      <w:r>
-        <w:t xml:space="preserve">or Ultimate 64 machines </w:t>
-      </w:r>
-      <w:r>
-        <w:t>and its emulated environment. This includes direct control over C64 execution (freeze/reboot), power management for emulated disk drives, and advanced utilities for REU and disk image handling.</w:t>
+        <w:t>SoftwareIEC</w:t>
+      </w:r>
+      <w:proofErr w:type="spellEnd"/>
+      <w:r>
+        <w:rPr>
+          <w:b/>
+          <w:bCs/>
+        </w:rPr>
+        <w:t xml:space="preserve"> Target”</w:t>
+      </w:r>
+      <w:r>
+        <w:t xml:space="preserve"> provides a</w:t>
+      </w:r>
+      <w:r>
+        <w:t xml:space="preserve">n optimized interface to the emulated disk drive that sits behind the </w:t>
+      </w:r>
+      <w:proofErr w:type="spellStart"/>
+      <w:r>
+        <w:t>SoftwareIEC</w:t>
+      </w:r>
+      <w:proofErr w:type="spellEnd"/>
+      <w:r>
+        <w:t xml:space="preserve"> interface. It bypasses the IEC protocol completely and therefore allows higher speed data transfers.</w:t>
       </w:r>
     </w:p>
     <w:p>
@@ -1593,7 +1602,15 @@
         <w:t>“</w:t>
       </w:r>
       <w:r>
-        <w:t>UCI Control Target</w:t>
+        <w:t xml:space="preserve">UCI </w:t>
+      </w:r>
+      <w:proofErr w:type="spellStart"/>
+      <w:r>
+        <w:t>SoftwareIEC</w:t>
+      </w:r>
+      <w:proofErr w:type="spellEnd"/>
+      <w:r>
+        <w:t xml:space="preserve"> Target</w:t>
       </w:r>
       <w:r>
         <w:t xml:space="preserve">” is a target of the “Ultimate </w:t>
@@ -1630,10 +1647,7 @@
     </w:p>
     <w:p>
       <w:r>
-        <w:t>This document describes the commands that can be sent to this target, their expected parameters, and the data returned to the C64. These commands allow programs to interact with the Ultimate’s management engine without leaving the C64 environment.</w:t>
-      </w:r>
-      <w:r>
-        <w:t xml:space="preserve"> </w:t>
+        <w:t xml:space="preserve">This document describes the commands that can be sent to this target, their expected parameters, and the data returned to the C64. </w:t>
       </w:r>
     </w:p>
     <w:p/>
@@ -1693,10 +1707,7 @@
         <w:t>Software IEC</w:t>
       </w:r>
       <w:r>
-        <w:t xml:space="preserve"> </w:t>
-      </w:r>
-      <w:r>
-        <w:t>T</w:t>
+        <w:t xml:space="preserve"> T</w:t>
       </w:r>
       <w:r>
         <w:t>arget</w:t>
@@ -2305,25 +2316,7 @@
         <w:t>Description:</w:t>
       </w:r>
       <w:r>
-        <w:t xml:space="preserve"> The </w:t>
-      </w:r>
-      <w:r>
-        <w:t>CLOSE</w:t>
-      </w:r>
-      <w:r>
-        <w:t xml:space="preserve"> command </w:t>
-      </w:r>
-      <w:r>
-        <w:t>closes the file that is associated with the channel</w:t>
-      </w:r>
-      <w:r>
-        <w:t xml:space="preserve"> indicated </w:t>
-      </w:r>
-      <w:r>
-        <w:t>by</w:t>
-      </w:r>
-      <w:r>
-        <w:t xml:space="preserve"> the secondary address.</w:t>
+        <w:t xml:space="preserve"> The CLOSE command closes the file that is associated with the channel indicated by the secondary address.</w:t>
       </w:r>
     </w:p>
     <w:p>
@@ -2406,6 +2399,7 @@
       <w:r>
         <w:t xml:space="preserve">The target pre-fetches the first 32 bytes of data and places them in the UCI Data Channel for immediate retrieval. Further data is fetched via the </w:t>
       </w:r>
+      <w:proofErr w:type="spellStart"/>
       <w:r>
         <w:rPr>
           <w:i/>
@@ -2413,19 +2407,33 @@
         </w:rPr>
         <w:t>get_more_data</w:t>
       </w:r>
+      <w:proofErr w:type="spellEnd"/>
       <w:r>
         <w:t xml:space="preserve"> mechanism.</w:t>
       </w:r>
     </w:p>
     <w:p>
       <w:r>
-        <w:t xml:space="preserve">Usually, CHKIN is followed by consecutive calls to CHRIN to read the data from the channel. It would be highly inefficient to send a UCI command for every byte that is being read. Therefore, HyperSpeed kernal simply allows data to be prefetched with the CHKIN command, and reads from the data channel whenever the function </w:t>
-      </w:r>
-      <w:r>
-        <w:t>CHRIN</w:t>
-      </w:r>
+        <w:t xml:space="preserve">Usually, CHKIN is followed by consecutive calls to CHRIN to read the data from the channel. It would be highly inefficient to send a UCI command for every byte that is being read. Therefore, </w:t>
+      </w:r>
+      <w:proofErr w:type="spellStart"/>
+      <w:r>
+        <w:t>HyperSpeed</w:t>
+      </w:r>
+      <w:proofErr w:type="spellEnd"/>
       <w:r>
         <w:t xml:space="preserve"> </w:t>
+      </w:r>
+      <w:proofErr w:type="spellStart"/>
+      <w:r>
+        <w:t>kernal</w:t>
+      </w:r>
+      <w:proofErr w:type="spellEnd"/>
+      <w:r>
+        <w:t xml:space="preserve"> simply allows data to be prefetched with the CHKIN command, and reads from the data channel whenever the function </w:t>
+      </w:r>
+      <w:r>
+        <w:t xml:space="preserve">CHRIN </w:t>
       </w:r>
       <w:r>
         <w:t>is called. This means that the UCI command is still ‘open’ when this happens. When CHRIN is called upon another channel, or any another command needs to be sent to the UCI, the pending CHKIN command is terminated first. This termination causes the exact number of bytes that was read from the response channel to be flushed from the stream, such that subsequent calls to CHKIN will prepare the next chunk of data from the file.</w:t>
@@ -2553,6 +2561,7 @@
       <w:r>
         <w:t xml:space="preserve">Automatic Throttling: The </w:t>
       </w:r>
+      <w:proofErr w:type="spellStart"/>
       <w:r>
         <w:rPr>
           <w:i/>
@@ -2560,6 +2569,7 @@
         </w:rPr>
         <w:t>prepare_data</w:t>
       </w:r>
+      <w:proofErr w:type="spellEnd"/>
       <w:r>
         <w:t xml:space="preserve"> function </w:t>
       </w:r>
@@ -2574,12 +2584,21 @@
       <w:r>
         <w:t xml:space="preserve">DMA Integration: The load/save/verify routines check </w:t>
       </w:r>
+      <w:proofErr w:type="spellStart"/>
       <w:r>
         <w:rPr>
           <w:i/>
           <w:iCs/>
         </w:rPr>
-        <w:t>is_dma_active().</w:t>
+        <w:t>is_dma_active</w:t>
+      </w:r>
+      <w:proofErr w:type="spellEnd"/>
+      <w:r>
+        <w:rPr>
+          <w:i/>
+          <w:iCs/>
+        </w:rPr>
+        <w:t>().</w:t>
       </w:r>
       <w:r>
         <w:t xml:space="preserve"> If the Ultimate is performing a DMA transfer, it pauses the C64 CPU to ensure data integrity.</w:t>
@@ -2587,7 +2606,15 @@
     </w:p>
     <w:p>
       <w:r>
-        <w:t xml:space="preserve">Kernal Emulation: This target is specifically designed to allow custom Kernals or fast-loaders to </w:t>
+        <w:t xml:space="preserve">Kernal Emulation: This target is specifically designed to allow custom </w:t>
+      </w:r>
+      <w:proofErr w:type="spellStart"/>
+      <w:r>
+        <w:t>Kernals</w:t>
+      </w:r>
+      <w:proofErr w:type="spellEnd"/>
+      <w:r>
+        <w:t xml:space="preserve"> or fast-loaders to </w:t>
       </w:r>
       <w:r>
         <w:t>avoid</w:t>
@@ -2596,17 +2623,21 @@
         <w:t xml:space="preserve"> the IEC protocol entirely </w:t>
       </w:r>
       <w:r>
-        <w:t>and access the SoftwareIEC directly through an efficient cartridge I/O mechanism.</w:t>
+        <w:t xml:space="preserve">and access the </w:t>
+      </w:r>
+      <w:proofErr w:type="spellStart"/>
+      <w:r>
+        <w:t>SoftwareIEC</w:t>
+      </w:r>
+      <w:proofErr w:type="spellEnd"/>
+      <w:r>
+        <w:t xml:space="preserve"> directly through an efficient cartridge I/O mechanism.</w:t>
       </w:r>
     </w:p>
     <w:p/>
     <w:sectPr>
-      <w:headerReference w:type="even" r:id="rId8"/>
-      <w:headerReference w:type="default" r:id="rId9"/>
-      <w:footerReference w:type="even" r:id="rId10"/>
-      <w:footerReference w:type="default" r:id="rId11"/>
-      <w:headerReference w:type="first" r:id="rId12"/>
-      <w:footerReference w:type="first" r:id="rId13"/>
+      <w:headerReference w:type="default" r:id="rId8"/>
+      <w:footerReference w:type="default" r:id="rId9"/>
       <w:type w:val="continuous"/>
       <w:pgSz w:w="11907" w:h="16839" w:code="9"/>
       <w:pgMar w:top="851" w:right="1134" w:bottom="993" w:left="1134" w:header="850" w:footer="510" w:gutter="0"/>
@@ -2650,16 +2681,6 @@
 </file>
 
 <file path=word/footer1.xml><?xml version="1.0" encoding="utf-8"?>
-<w:ftr xmlns:wpc="http://schemas.microsoft.com/office/word/2010/wordprocessingCanvas" xmlns:cx="http://schemas.microsoft.com/office/drawing/2014/chartex" xmlns:cx1="http://schemas.microsoft.com/office/drawing/2015/9/8/chartex" xmlns:cx2="http://schemas.microsoft.com/office/drawing/2015/10/21/chartex" xmlns:cx3="http://schemas.microsoft.com/office/drawing/2016/5/9/chartex" xmlns:cx4="http://schemas.microsoft.com/office/drawing/2016/5/10/chartex" xmlns:cx5="http://schemas.microsoft.com/office/drawing/2016/5/11/chartex" xmlns:cx6="http://schemas.microsoft.com/office/drawing/2016/5/12/chartex" xmlns:cx7="http://schemas.microsoft.com/office/drawing/2016/5/13/chartex" xmlns:cx8="http://schemas.microsoft.com/office/drawing/2016/5/14/chartex" xmlns:mc="http://schemas.openxmlformats.org/markup-compatibility/2006" xmlns:aink="http://schemas.microsoft.com/office/drawing/2016/ink" xmlns:am3d="http://schemas.microsoft.com/office/drawing/2017/model3d" xmlns:o="urn:schemas-microsoft-com:office:office" xmlns:oel="http://schemas.microsoft.com/office/2019/extlst" xmlns:r="http://schemas.openxmlformats.org/officeDocument/2006/relationships" xmlns:m="http://schemas.openxmlformats.org/officeDocument/2006/math" xmlns:v="urn:schemas-microsoft-com:vml" xmlns:wp14="http://schemas.microsoft.com/office/word/2010/wordprocessingDrawing" xmlns:wp="http://schemas.openxmlformats.org/drawingml/2006/wordprocessingDrawing" xmlns:w10="urn:schemas-microsoft-com:office:word" xmlns:w="http://schemas.openxmlformats.org/wordprocessingml/2006/main" xmlns:w14="http://schemas.microsoft.com/office/word/2010/wordml" xmlns:w15="http://schemas.microsoft.com/office/word/2012/wordml" xmlns:w16cex="http://schemas.microsoft.com/office/word/2018/wordml/cex" xmlns:w16cid="http://schemas.microsoft.com/office/word/2016/wordml/cid" xmlns:w16="http://schemas.microsoft.com/office/word/2018/wordml" xmlns:w16sdtdh="http://schemas.microsoft.com/office/word/2020/wordml/sdtdatahash" xmlns:w16se="http://schemas.microsoft.com/office/word/2015/wordml/symex" xmlns:wpg="http://schemas.microsoft.com/office/word/2010/wordprocessingGroup" xmlns:wpi="http://schemas.microsoft.com/office/word/2010/wordprocessingInk" xmlns:wne="http://schemas.microsoft.com/office/word/2006/wordml" xmlns:wps="http://schemas.microsoft.com/office/word/2010/wordprocessingShape" mc:Ignorable="w14 w15 w16se w16cid w16 w16cex w16sdtdh wp14">
-  <w:p>
-    <w:pPr>
-      <w:pStyle w:val="Footer"/>
-    </w:pPr>
-  </w:p>
-</w:ftr>
-</file>
-
-<file path=word/footer2.xml><?xml version="1.0" encoding="utf-8"?>
 <w:ftr xmlns:wpc="http://schemas.microsoft.com/office/word/2010/wordprocessingCanvas" xmlns:cx="http://schemas.microsoft.com/office/drawing/2014/chartex" xmlns:cx1="http://schemas.microsoft.com/office/drawing/2015/9/8/chartex" xmlns:cx2="http://schemas.microsoft.com/office/drawing/2015/10/21/chartex" xmlns:cx3="http://schemas.microsoft.com/office/drawing/2016/5/9/chartex" xmlns:cx4="http://schemas.microsoft.com/office/drawing/2016/5/10/chartex" xmlns:cx5="http://schemas.microsoft.com/office/drawing/2016/5/11/chartex" xmlns:cx6="http://schemas.microsoft.com/office/drawing/2016/5/12/chartex" xmlns:cx7="http://schemas.microsoft.com/office/drawing/2016/5/13/chartex" xmlns:cx8="http://schemas.microsoft.com/office/drawing/2016/5/14/chartex" xmlns:mc="http://schemas.openxmlformats.org/markup-compatibility/2006" xmlns:aink="http://schemas.microsoft.com/office/drawing/2016/ink" xmlns:am3d="http://schemas.microsoft.com/office/drawing/2017/model3d" xmlns:o="urn:schemas-microsoft-com:office:office" xmlns:oel="http://schemas.microsoft.com/office/2019/extlst" xmlns:r="http://schemas.openxmlformats.org/officeDocument/2006/relationships" xmlns:m="http://schemas.openxmlformats.org/officeDocument/2006/math" xmlns:v="urn:schemas-microsoft-com:vml" xmlns:wp14="http://schemas.microsoft.com/office/word/2010/wordprocessingDrawing" xmlns:wp="http://schemas.openxmlformats.org/drawingml/2006/wordprocessingDrawing" xmlns:w10="urn:schemas-microsoft-com:office:word" xmlns:w="http://schemas.openxmlformats.org/wordprocessingml/2006/main" xmlns:w14="http://schemas.microsoft.com/office/word/2010/wordml" xmlns:w15="http://schemas.microsoft.com/office/word/2012/wordml" xmlns:w16cex="http://schemas.microsoft.com/office/word/2018/wordml/cex" xmlns:w16cid="http://schemas.microsoft.com/office/word/2016/wordml/cid" xmlns:w16="http://schemas.microsoft.com/office/word/2018/wordml" xmlns:w16sdtdh="http://schemas.microsoft.com/office/word/2020/wordml/sdtdatahash" xmlns:w16se="http://schemas.microsoft.com/office/word/2015/wordml/symex" xmlns:wpg="http://schemas.microsoft.com/office/word/2010/wordprocessingGroup" xmlns:wpi="http://schemas.microsoft.com/office/word/2010/wordprocessingInk" xmlns:wne="http://schemas.microsoft.com/office/word/2006/wordml" xmlns:wps="http://schemas.microsoft.com/office/word/2010/wordprocessingShape" mc:Ignorable="w14 w15 w16se w16cid w16 w16cex w16sdtdh wp14">
   <w:p>
     <w:pPr>
@@ -2694,16 +2715,14 @@
           <w:r>
             <w:t xml:space="preserve">Version </w:t>
           </w:r>
-          <w:fldSimple w:instr=" DOCPROPERTY &quot;Version&quot; \* MERGEFORMAT ">
-            <w:r>
-              <w:t>1.1</w:t>
-            </w:r>
-          </w:fldSimple>
+          <w:r>
+            <w:t>1.0,</w:t>
+          </w:r>
           <w:r>
             <w:rPr>
               <w:bCs/>
             </w:rPr>
-            <w:t xml:space="preserve">, </w:t>
+            <w:t xml:space="preserve"> </w:t>
           </w:r>
           <w:r>
             <w:t xml:space="preserve"> </w:t>
@@ -2792,16 +2811,6 @@
 </w:ftr>
 </file>
 
-<file path=word/footer3.xml><?xml version="1.0" encoding="utf-8"?>
-<w:ftr xmlns:wpc="http://schemas.microsoft.com/office/word/2010/wordprocessingCanvas" xmlns:cx="http://schemas.microsoft.com/office/drawing/2014/chartex" xmlns:cx1="http://schemas.microsoft.com/office/drawing/2015/9/8/chartex" xmlns:cx2="http://schemas.microsoft.com/office/drawing/2015/10/21/chartex" xmlns:cx3="http://schemas.microsoft.com/office/drawing/2016/5/9/chartex" xmlns:cx4="http://schemas.microsoft.com/office/drawing/2016/5/10/chartex" xmlns:cx5="http://schemas.microsoft.com/office/drawing/2016/5/11/chartex" xmlns:cx6="http://schemas.microsoft.com/office/drawing/2016/5/12/chartex" xmlns:cx7="http://schemas.microsoft.com/office/drawing/2016/5/13/chartex" xmlns:cx8="http://schemas.microsoft.com/office/drawing/2016/5/14/chartex" xmlns:mc="http://schemas.openxmlformats.org/markup-compatibility/2006" xmlns:aink="http://schemas.microsoft.com/office/drawing/2016/ink" xmlns:am3d="http://schemas.microsoft.com/office/drawing/2017/model3d" xmlns:o="urn:schemas-microsoft-com:office:office" xmlns:oel="http://schemas.microsoft.com/office/2019/extlst" xmlns:r="http://schemas.openxmlformats.org/officeDocument/2006/relationships" xmlns:m="http://schemas.openxmlformats.org/officeDocument/2006/math" xmlns:v="urn:schemas-microsoft-com:vml" xmlns:wp14="http://schemas.microsoft.com/office/word/2010/wordprocessingDrawing" xmlns:wp="http://schemas.openxmlformats.org/drawingml/2006/wordprocessingDrawing" xmlns:w10="urn:schemas-microsoft-com:office:word" xmlns:w="http://schemas.openxmlformats.org/wordprocessingml/2006/main" xmlns:w14="http://schemas.microsoft.com/office/word/2010/wordml" xmlns:w15="http://schemas.microsoft.com/office/word/2012/wordml" xmlns:w16cex="http://schemas.microsoft.com/office/word/2018/wordml/cex" xmlns:w16cid="http://schemas.microsoft.com/office/word/2016/wordml/cid" xmlns:w16="http://schemas.microsoft.com/office/word/2018/wordml" xmlns:w16sdtdh="http://schemas.microsoft.com/office/word/2020/wordml/sdtdatahash" xmlns:w16se="http://schemas.microsoft.com/office/word/2015/wordml/symex" xmlns:wpg="http://schemas.microsoft.com/office/word/2010/wordprocessingGroup" xmlns:wpi="http://schemas.microsoft.com/office/word/2010/wordprocessingInk" xmlns:wne="http://schemas.microsoft.com/office/word/2006/wordml" xmlns:wps="http://schemas.microsoft.com/office/word/2010/wordprocessingShape" mc:Ignorable="w14 w15 w16se w16cid w16 w16cex w16sdtdh wp14">
-  <w:p>
-    <w:pPr>
-      <w:pStyle w:val="Footer"/>
-    </w:pPr>
-  </w:p>
-</w:ftr>
-</file>
-
 <file path=word/footnotes.xml><?xml version="1.0" encoding="utf-8"?>
 <w:footnotes xmlns:wpc="http://schemas.microsoft.com/office/word/2010/wordprocessingCanvas" xmlns:cx="http://schemas.microsoft.com/office/drawing/2014/chartex" xmlns:cx1="http://schemas.microsoft.com/office/drawing/2015/9/8/chartex" xmlns:cx2="http://schemas.microsoft.com/office/drawing/2015/10/21/chartex" xmlns:cx3="http://schemas.microsoft.com/office/drawing/2016/5/9/chartex" xmlns:cx4="http://schemas.microsoft.com/office/drawing/2016/5/10/chartex" xmlns:cx5="http://schemas.microsoft.com/office/drawing/2016/5/11/chartex" xmlns:cx6="http://schemas.microsoft.com/office/drawing/2016/5/12/chartex" xmlns:cx7="http://schemas.microsoft.com/office/drawing/2016/5/13/chartex" xmlns:cx8="http://schemas.microsoft.com/office/drawing/2016/5/14/chartex" xmlns:mc="http://schemas.openxmlformats.org/markup-compatibility/2006" xmlns:aink="http://schemas.microsoft.com/office/drawing/2016/ink" xmlns:am3d="http://schemas.microsoft.com/office/drawing/2017/model3d" xmlns:o="urn:schemas-microsoft-com:office:office" xmlns:oel="http://schemas.microsoft.com/office/2019/extlst" xmlns:r="http://schemas.openxmlformats.org/officeDocument/2006/relationships" xmlns:m="http://schemas.openxmlformats.org/officeDocument/2006/math" xmlns:v="urn:schemas-microsoft-com:vml" xmlns:wp14="http://schemas.microsoft.com/office/word/2010/wordprocessingDrawing" xmlns:wp="http://schemas.openxmlformats.org/drawingml/2006/wordprocessingDrawing" xmlns:w10="urn:schemas-microsoft-com:office:word" xmlns:w="http://schemas.openxmlformats.org/wordprocessingml/2006/main" xmlns:w14="http://schemas.microsoft.com/office/word/2010/wordml" xmlns:w15="http://schemas.microsoft.com/office/word/2012/wordml" xmlns:w16cex="http://schemas.microsoft.com/office/word/2018/wordml/cex" xmlns:w16cid="http://schemas.microsoft.com/office/word/2016/wordml/cid" xmlns:w16="http://schemas.microsoft.com/office/word/2018/wordml" xmlns:w16sdtdh="http://schemas.microsoft.com/office/word/2020/wordml/sdtdatahash" xmlns:w16se="http://schemas.microsoft.com/office/word/2015/wordml/symex" xmlns:wpg="http://schemas.microsoft.com/office/word/2010/wordprocessingGroup" xmlns:wpi="http://schemas.microsoft.com/office/word/2010/wordprocessingInk" xmlns:wne="http://schemas.microsoft.com/office/word/2006/wordml" xmlns:wps="http://schemas.microsoft.com/office/word/2010/wordprocessingShape" mc:Ignorable="w14 w15 w16se w16cid w16 w16cex w16sdtdh wp14">
   <w:footnote w:type="separator" w:id="-1">
@@ -2828,16 +2837,6 @@
 </file>
 
 <file path=word/header1.xml><?xml version="1.0" encoding="utf-8"?>
-<w:hdr xmlns:wpc="http://schemas.microsoft.com/office/word/2010/wordprocessingCanvas" xmlns:cx="http://schemas.microsoft.com/office/drawing/2014/chartex" xmlns:cx1="http://schemas.microsoft.com/office/drawing/2015/9/8/chartex" xmlns:cx2="http://schemas.microsoft.com/office/drawing/2015/10/21/chartex" xmlns:cx3="http://schemas.microsoft.com/office/drawing/2016/5/9/chartex" xmlns:cx4="http://schemas.microsoft.com/office/drawing/2016/5/10/chartex" xmlns:cx5="http://schemas.microsoft.com/office/drawing/2016/5/11/chartex" xmlns:cx6="http://schemas.microsoft.com/office/drawing/2016/5/12/chartex" xmlns:cx7="http://schemas.microsoft.com/office/drawing/2016/5/13/chartex" xmlns:cx8="http://schemas.microsoft.com/office/drawing/2016/5/14/chartex" xmlns:mc="http://schemas.openxmlformats.org/markup-compatibility/2006" xmlns:aink="http://schemas.microsoft.com/office/drawing/2016/ink" xmlns:am3d="http://schemas.microsoft.com/office/drawing/2017/model3d" xmlns:o="urn:schemas-microsoft-com:office:office" xmlns:oel="http://schemas.microsoft.com/office/2019/extlst" xmlns:r="http://schemas.openxmlformats.org/officeDocument/2006/relationships" xmlns:m="http://schemas.openxmlformats.org/officeDocument/2006/math" xmlns:v="urn:schemas-microsoft-com:vml" xmlns:wp14="http://schemas.microsoft.com/office/word/2010/wordprocessingDrawing" xmlns:wp="http://schemas.openxmlformats.org/drawingml/2006/wordprocessingDrawing" xmlns:w10="urn:schemas-microsoft-com:office:word" xmlns:w="http://schemas.openxmlformats.org/wordprocessingml/2006/main" xmlns:w14="http://schemas.microsoft.com/office/word/2010/wordml" xmlns:w15="http://schemas.microsoft.com/office/word/2012/wordml" xmlns:w16cex="http://schemas.microsoft.com/office/word/2018/wordml/cex" xmlns:w16cid="http://schemas.microsoft.com/office/word/2016/wordml/cid" xmlns:w16="http://schemas.microsoft.com/office/word/2018/wordml" xmlns:w16sdtdh="http://schemas.microsoft.com/office/word/2020/wordml/sdtdatahash" xmlns:w16se="http://schemas.microsoft.com/office/word/2015/wordml/symex" xmlns:wpg="http://schemas.microsoft.com/office/word/2010/wordprocessingGroup" xmlns:wpi="http://schemas.microsoft.com/office/word/2010/wordprocessingInk" xmlns:wne="http://schemas.microsoft.com/office/word/2006/wordml" xmlns:wps="http://schemas.microsoft.com/office/word/2010/wordprocessingShape" mc:Ignorable="w14 w15 w16se w16cid w16 w16cex w16sdtdh wp14">
-  <w:p>
-    <w:pPr>
-      <w:pStyle w:val="Header"/>
-    </w:pPr>
-  </w:p>
-</w:hdr>
-</file>
-
-<file path=word/header2.xml><?xml version="1.0" encoding="utf-8"?>
 <w:hdr xmlns:wpc="http://schemas.microsoft.com/office/word/2010/wordprocessingCanvas" xmlns:cx="http://schemas.microsoft.com/office/drawing/2014/chartex" xmlns:cx1="http://schemas.microsoft.com/office/drawing/2015/9/8/chartex" xmlns:cx2="http://schemas.microsoft.com/office/drawing/2015/10/21/chartex" xmlns:cx3="http://schemas.microsoft.com/office/drawing/2016/5/9/chartex" xmlns:cx4="http://schemas.microsoft.com/office/drawing/2016/5/10/chartex" xmlns:cx5="http://schemas.microsoft.com/office/drawing/2016/5/11/chartex" xmlns:cx6="http://schemas.microsoft.com/office/drawing/2016/5/12/chartex" xmlns:cx7="http://schemas.microsoft.com/office/drawing/2016/5/13/chartex" xmlns:cx8="http://schemas.microsoft.com/office/drawing/2016/5/14/chartex" xmlns:mc="http://schemas.openxmlformats.org/markup-compatibility/2006" xmlns:aink="http://schemas.microsoft.com/office/drawing/2016/ink" xmlns:am3d="http://schemas.microsoft.com/office/drawing/2017/model3d" xmlns:o="urn:schemas-microsoft-com:office:office" xmlns:oel="http://schemas.microsoft.com/office/2019/extlst" xmlns:r="http://schemas.openxmlformats.org/officeDocument/2006/relationships" xmlns:m="http://schemas.openxmlformats.org/officeDocument/2006/math" xmlns:v="urn:schemas-microsoft-com:vml" xmlns:wp14="http://schemas.microsoft.com/office/word/2010/wordprocessingDrawing" xmlns:wp="http://schemas.openxmlformats.org/drawingml/2006/wordprocessingDrawing" xmlns:w10="urn:schemas-microsoft-com:office:word" xmlns:w="http://schemas.openxmlformats.org/wordprocessingml/2006/main" xmlns:w14="http://schemas.microsoft.com/office/word/2010/wordml" xmlns:w15="http://schemas.microsoft.com/office/word/2012/wordml" xmlns:w16cex="http://schemas.microsoft.com/office/word/2018/wordml/cex" xmlns:w16cid="http://schemas.microsoft.com/office/word/2016/wordml/cid" xmlns:w16="http://schemas.microsoft.com/office/word/2018/wordml" xmlns:w16sdtdh="http://schemas.microsoft.com/office/word/2020/wordml/sdtdatahash" xmlns:w16se="http://schemas.microsoft.com/office/word/2015/wordml/symex" xmlns:wpg="http://schemas.microsoft.com/office/word/2010/wordprocessingGroup" xmlns:wpi="http://schemas.microsoft.com/office/word/2010/wordprocessingInk" xmlns:wne="http://schemas.microsoft.com/office/word/2006/wordml" xmlns:wps="http://schemas.microsoft.com/office/word/2010/wordprocessingShape" mc:Ignorable="w14 w15 w16se w16cid w16 w16cex w16sdtdh wp14">
   <w:tbl>
     <w:tblPr>
@@ -2910,16 +2909,6 @@
       </w:tc>
     </w:tr>
   </w:tbl>
-  <w:p>
-    <w:pPr>
-      <w:pStyle w:val="Header"/>
-    </w:pPr>
-  </w:p>
-</w:hdr>
-</file>
-
-<file path=word/header3.xml><?xml version="1.0" encoding="utf-8"?>
-<w:hdr xmlns:wpc="http://schemas.microsoft.com/office/word/2010/wordprocessingCanvas" xmlns:cx="http://schemas.microsoft.com/office/drawing/2014/chartex" xmlns:cx1="http://schemas.microsoft.com/office/drawing/2015/9/8/chartex" xmlns:cx2="http://schemas.microsoft.com/office/drawing/2015/10/21/chartex" xmlns:cx3="http://schemas.microsoft.com/office/drawing/2016/5/9/chartex" xmlns:cx4="http://schemas.microsoft.com/office/drawing/2016/5/10/chartex" xmlns:cx5="http://schemas.microsoft.com/office/drawing/2016/5/11/chartex" xmlns:cx6="http://schemas.microsoft.com/office/drawing/2016/5/12/chartex" xmlns:cx7="http://schemas.microsoft.com/office/drawing/2016/5/13/chartex" xmlns:cx8="http://schemas.microsoft.com/office/drawing/2016/5/14/chartex" xmlns:mc="http://schemas.openxmlformats.org/markup-compatibility/2006" xmlns:aink="http://schemas.microsoft.com/office/drawing/2016/ink" xmlns:am3d="http://schemas.microsoft.com/office/drawing/2017/model3d" xmlns:o="urn:schemas-microsoft-com:office:office" xmlns:oel="http://schemas.microsoft.com/office/2019/extlst" xmlns:r="http://schemas.openxmlformats.org/officeDocument/2006/relationships" xmlns:m="http://schemas.openxmlformats.org/officeDocument/2006/math" xmlns:v="urn:schemas-microsoft-com:vml" xmlns:wp14="http://schemas.microsoft.com/office/word/2010/wordprocessingDrawing" xmlns:wp="http://schemas.openxmlformats.org/drawingml/2006/wordprocessingDrawing" xmlns:w10="urn:schemas-microsoft-com:office:word" xmlns:w="http://schemas.openxmlformats.org/wordprocessingml/2006/main" xmlns:w14="http://schemas.microsoft.com/office/word/2010/wordml" xmlns:w15="http://schemas.microsoft.com/office/word/2012/wordml" xmlns:w16cex="http://schemas.microsoft.com/office/word/2018/wordml/cex" xmlns:w16cid="http://schemas.microsoft.com/office/word/2016/wordml/cid" xmlns:w16="http://schemas.microsoft.com/office/word/2018/wordml" xmlns:w16sdtdh="http://schemas.microsoft.com/office/word/2020/wordml/sdtdatahash" xmlns:w16se="http://schemas.microsoft.com/office/word/2015/wordml/symex" xmlns:wpg="http://schemas.microsoft.com/office/word/2010/wordprocessingGroup" xmlns:wpi="http://schemas.microsoft.com/office/word/2010/wordprocessingInk" xmlns:wne="http://schemas.microsoft.com/office/word/2006/wordml" xmlns:wps="http://schemas.microsoft.com/office/word/2010/wordprocessingShape" mc:Ignorable="w14 w15 w16se w16cid w16 w16cex w16sdtdh wp14">
   <w:p>
     <w:pPr>
       <w:pStyle w:val="Header"/>
@@ -10429,6 +10418,7 @@
   <w:style w:type="character" w:default="1" w:styleId="DefaultParagraphFont">
     <w:name w:val="Default Paragraph Font"/>
     <w:uiPriority w:val="1"/>
+    <w:semiHidden/>
     <w:unhideWhenUsed/>
   </w:style>
   <w:style w:type="table" w:default="1" w:styleId="TableNormal">
@@ -11688,6 +11678,7 @@
     <w:rsid w:val="00723BFE"/>
     <w:rsid w:val="007334C3"/>
     <w:rsid w:val="007B1F98"/>
+    <w:rsid w:val="0086378F"/>
     <w:rsid w:val="00977187"/>
     <w:rsid w:val="009D2ECD"/>
     <w:rsid w:val="00AA199C"/>

</xml_diff>